<commit_message>
docs(reports): sincroniza métricas com execução atual
</commit_message>
<xml_diff>
--- a/reports/relatorio_abnt.docx
+++ b/reports/relatorio_abnt.docx
@@ -4822,7 +4822,7 @@
           <w:rFonts w:ascii="Times New Roman" w:hAnsi="Times New Roman"/>
           <w:sz w:val="24"/>
         </w:rPr>
-        <w:t>Para controlar o overfitting, foram aplicadas três formas complementares de regularização:</w:t>
+        <w:t>Para controlar o overfitting, foram aplicadas duas estratégias:</w:t>
       </w:r>
     </w:p>
     <w:p>
@@ -4836,7 +4836,7 @@
           <w:rFonts w:ascii="Times New Roman" w:hAnsi="Times New Roman"/>
           <w:sz w:val="24"/>
         </w:rPr>
-        <w:t xml:space="preserve">• </w:t>
+        <w:t>• Early Stopping (paciência = 12 épocas): monitora a loss de validação e restaura os pesos da melhor época.</w:t>
       </w:r>
       <w:r>
         <w:rPr>
@@ -4844,14 +4844,12 @@
           <w:b/>
           <w:sz w:val="24"/>
         </w:rPr>
-        <w:t>Regularização L2</w:t>
       </w:r>
       <w:r>
         <w:rPr>
           <w:rFonts w:ascii="Times New Roman" w:hAnsi="Times New Roman"/>
           <w:sz w:val="24"/>
         </w:rPr>
-        <w:t xml:space="preserve"> (λ = 0,0001): penaliza pesos grandes, incentivando soluções mais suaves.</w:t>
       </w:r>
     </w:p>
     <w:p>
@@ -4865,7 +4863,7 @@
           <w:rFonts w:ascii="Times New Roman" w:hAnsi="Times New Roman"/>
           <w:sz w:val="24"/>
         </w:rPr>
-        <w:t xml:space="preserve">• </w:t>
+        <w:t>• Semente fixa + execução determinística: reduz variação entre execuções da rede para comparação estável.</w:t>
       </w:r>
       <w:r>
         <w:rPr>
@@ -4873,14 +4871,12 @@
           <w:b/>
           <w:sz w:val="24"/>
         </w:rPr>
-        <w:t>Dropout</w:t>
       </w:r>
       <w:r>
         <w:rPr>
           <w:rFonts w:ascii="Times New Roman" w:hAnsi="Times New Roman"/>
           <w:sz w:val="24"/>
         </w:rPr>
-        <w:t xml:space="preserve"> (taxa = 10%): desativa aleatoriamente 10% dos neurônios a cada batch durante o treino, reduzindo co-adaptações e funcionando como um ensemble implícito.</w:t>
       </w:r>
     </w:p>
     <w:p>
@@ -4894,7 +4890,7 @@
           <w:rFonts w:ascii="Times New Roman" w:hAnsi="Times New Roman"/>
           <w:sz w:val="24"/>
         </w:rPr>
-        <w:t xml:space="preserve">• </w:t>
+        <w:t>• Early Stopping (paciência = 12 épocas): monitora a loss de validação e restaura os pesos da melhor época.</w:t>
       </w:r>
       <w:r>
         <w:rPr>
@@ -4902,14 +4898,12 @@
           <w:b/>
           <w:sz w:val="24"/>
         </w:rPr>
-        <w:t>Early Stopping</w:t>
       </w:r>
       <w:r>
         <w:rPr>
           <w:rFonts w:ascii="Times New Roman" w:hAnsi="Times New Roman"/>
           <w:sz w:val="24"/>
         </w:rPr>
-        <w:t xml:space="preserve"> (paciência = 25 épocas): monitora a loss de validação e restaura os pesos da melhor época, evitando o overfitting tardio.</w:t>
       </w:r>
     </w:p>
     <w:p>
@@ -5267,13 +5261,14 @@
             <w:pPr>
               <w:jc w:val="left"/>
             </w:pPr>
-            <w:r/>
+            <w:r>
+              <w:t>29 (parada na 41)</w:t>
+            </w:r>
             <w:r>
               <w:rPr>
                 <w:rFonts w:ascii="Times New Roman" w:hAnsi="Times New Roman"/>
                 <w:sz w:val="20"/>
               </w:rPr>
-              <w:t>85 (parada na 110)</w:t>
             </w:r>
           </w:p>
         </w:tc>
@@ -5465,13 +5460,14 @@
             <w:pPr>
               <w:jc w:val="left"/>
             </w:pPr>
-            <w:r/>
+            <w:r>
+              <w:t>30,77%</w:t>
+            </w:r>
             <w:r>
               <w:rPr>
                 <w:rFonts w:ascii="Times New Roman" w:hAnsi="Times New Roman"/>
                 <w:sz w:val="20"/>
               </w:rPr>
-              <w:t>30,25%</w:t>
             </w:r>
           </w:p>
         </w:tc>
@@ -5503,13 +5499,14 @@
             <w:pPr>
               <w:jc w:val="left"/>
             </w:pPr>
-            <w:r/>
+            <w:r>
+              <w:t>34,02%</w:t>
+            </w:r>
             <w:r>
               <w:rPr>
                 <w:rFonts w:ascii="Times New Roman" w:hAnsi="Times New Roman"/>
                 <w:sz w:val="20"/>
               </w:rPr>
-              <w:t>33,48%</w:t>
             </w:r>
           </w:p>
         </w:tc>
@@ -5541,13 +5538,14 @@
             <w:pPr>
               <w:jc w:val="left"/>
             </w:pPr>
-            <w:r/>
+            <w:r>
+              <w:t>3,25%</w:t>
+            </w:r>
             <w:r>
               <w:rPr>
                 <w:rFonts w:ascii="Times New Roman" w:hAnsi="Times New Roman"/>
                 <w:sz w:val="20"/>
               </w:rPr>
-              <w:t>3,23%</w:t>
             </w:r>
           </w:p>
         </w:tc>
@@ -5579,13 +5577,14 @@
             <w:pPr>
               <w:jc w:val="left"/>
             </w:pPr>
-            <w:r/>
+            <w:r>
+              <w:t>65,98%</w:t>
+            </w:r>
             <w:r>
               <w:rPr>
                 <w:rFonts w:ascii="Times New Roman" w:hAnsi="Times New Roman"/>
                 <w:sz w:val="20"/>
               </w:rPr>
-              <w:t>66,52%</w:t>
             </w:r>
           </w:p>
         </w:tc>
@@ -5617,13 +5616,14 @@
             <w:pPr>
               <w:jc w:val="left"/>
             </w:pPr>
-            <w:r/>
+            <w:r>
+              <w:t>66,30%</w:t>
+            </w:r>
             <w:r>
               <w:rPr>
                 <w:rFonts w:ascii="Times New Roman" w:hAnsi="Times New Roman"/>
                 <w:sz w:val="20"/>
               </w:rPr>
-              <w:t>65,59%</w:t>
             </w:r>
           </w:p>
         </w:tc>
@@ -5655,13 +5655,14 @@
             <w:pPr>
               <w:jc w:val="left"/>
             </w:pPr>
-            <w:r/>
+            <w:r>
+              <w:t>64,99%</w:t>
+            </w:r>
             <w:r>
               <w:rPr>
                 <w:rFonts w:ascii="Times New Roman" w:hAnsi="Times New Roman"/>
                 <w:sz w:val="20"/>
               </w:rPr>
-              <w:t>69,48%</w:t>
             </w:r>
           </w:p>
         </w:tc>
@@ -5693,13 +5694,14 @@
             <w:pPr>
               <w:jc w:val="left"/>
             </w:pPr>
-            <w:r/>
+            <w:r>
+              <w:t>65,64%</w:t>
+            </w:r>
             <w:r>
               <w:rPr>
                 <w:rFonts w:ascii="Times New Roman" w:hAnsi="Times New Roman"/>
                 <w:sz w:val="20"/>
               </w:rPr>
-              <w:t>67,48%</w:t>
             </w:r>
           </w:p>
         </w:tc>
@@ -5721,7 +5723,7 @@
           <w:rFonts w:ascii="Times New Roman" w:hAnsi="Times New Roman"/>
           <w:sz w:val="24"/>
         </w:rPr>
-        <w:t>O gap de 3,23% está abaixo do limiar de 5% adotado como critério de overfitting, confirmando que a regularização foi eficaz. A curva de loss por época demonstra convergência estável com val_loss acompanhando a train_loss sem divergência expressiva.</w:t>
+        <w:t>O gap de 3,25% está abaixo do limiar de 5% adotado como critério de overfitting, confirmando que a regularização foi eficaz. A curva de loss por época demonstra convergência estável com val_loss acompanhando a train_loss sem divergência expressiva.</w:t>
       </w:r>
     </w:p>
     <w:p>
@@ -5897,13 +5899,14 @@
             <w:pPr>
               <w:jc w:val="left"/>
             </w:pPr>
-            <w:r/>
+            <w:r>
+              <w:t>39,32%</w:t>
+            </w:r>
             <w:r>
               <w:rPr>
                 <w:rFonts w:ascii="Times New Roman" w:hAnsi="Times New Roman"/>
                 <w:sz w:val="20"/>
               </w:rPr>
-              <w:t>39,30%</w:t>
             </w:r>
           </w:p>
         </w:tc>
@@ -5935,13 +5938,14 @@
             <w:pPr>
               <w:jc w:val="left"/>
             </w:pPr>
-            <w:r/>
+            <w:r>
+              <w:t>39,32%</w:t>
+            </w:r>
             <w:r>
               <w:rPr>
                 <w:rFonts w:ascii="Times New Roman" w:hAnsi="Times New Roman"/>
                 <w:sz w:val="20"/>
               </w:rPr>
-              <w:t>39,30%</w:t>
             </w:r>
           </w:p>
         </w:tc>
@@ -6008,16 +6012,8 @@
             <w:tcW w:type="dxa" w:w="4702"/>
           </w:tcPr>
           <w:p>
-            <w:pPr>
-              <w:jc w:val="left"/>
-            </w:pPr>
-            <w:r/>
-            <w:r>
-              <w:rPr>
-                <w:rFonts w:ascii="Times New Roman" w:hAnsi="Times New Roman"/>
-                <w:sz w:val="20"/>
-              </w:rPr>
-              <w:t>33</w:t>
+            <w:r>
+              <w:t>24</w:t>
             </w:r>
           </w:p>
         </w:tc>
@@ -6700,6 +6696,18 @@
             <w:tcW w:type="dxa" w:w="4702"/>
           </w:tcPr>
           <w:p>
+            <w:r>
+              <w:t>65,28%</w:t>
+            </w:r>
+          </w:p>
+        </w:tc>
+      </w:tr>
+      <w:tr>
+        <w:tc>
+          <w:tcPr>
+            <w:tcW w:type="dxa" w:w="4702"/>
+          </w:tcPr>
+          <w:p>
             <w:pPr>
               <w:jc w:val="left"/>
             </w:pPr>
@@ -6709,45 +6717,17 @@
                 <w:rFonts w:ascii="Times New Roman" w:hAnsi="Times New Roman"/>
                 <w:sz w:val="20"/>
               </w:rPr>
-              <w:t>65,29%</w:t>
-            </w:r>
-          </w:p>
-        </w:tc>
-      </w:tr>
-      <w:tr>
+              <w:t>Recall</w:t>
+            </w:r>
+          </w:p>
+        </w:tc>
         <w:tc>
           <w:tcPr>
             <w:tcW w:type="dxa" w:w="4702"/>
           </w:tcPr>
           <w:p>
-            <w:pPr>
-              <w:jc w:val="left"/>
-            </w:pPr>
-            <w:r/>
-            <w:r>
-              <w:rPr>
-                <w:rFonts w:ascii="Times New Roman" w:hAnsi="Times New Roman"/>
-                <w:sz w:val="20"/>
-              </w:rPr>
-              <w:t>Recall</w:t>
-            </w:r>
-          </w:p>
-        </w:tc>
-        <w:tc>
-          <w:tcPr>
-            <w:tcW w:type="dxa" w:w="4702"/>
-          </w:tcPr>
-          <w:p>
-            <w:pPr>
-              <w:jc w:val="left"/>
-            </w:pPr>
-            <w:r/>
-            <w:r>
-              <w:rPr>
-                <w:rFonts w:ascii="Times New Roman" w:hAnsi="Times New Roman"/>
-                <w:sz w:val="20"/>
-              </w:rPr>
-              <w:t>67,52%</w:t>
+            <w:r>
+              <w:t>67,50%</w:t>
             </w:r>
           </w:p>
         </w:tc>
@@ -7472,13 +7452,14 @@
             <w:pPr>
               <w:jc w:val="left"/>
             </w:pPr>
-            <w:r/>
+            <w:r>
+              <w:t>65,14%</w:t>
+            </w:r>
             <w:r>
               <w:rPr>
                 <w:rFonts w:ascii="Times New Roman" w:hAnsi="Times New Roman"/>
                 <w:sz w:val="20"/>
               </w:rPr>
-              <w:t>65,06%</w:t>
             </w:r>
           </w:p>
         </w:tc>
@@ -7510,13 +7491,14 @@
             <w:pPr>
               <w:jc w:val="left"/>
             </w:pPr>
-            <w:r/>
+            <w:r>
+              <w:t>71,45%</w:t>
+            </w:r>
             <w:r>
               <w:rPr>
                 <w:rFonts w:ascii="Times New Roman" w:hAnsi="Times New Roman"/>
                 <w:sz w:val="20"/>
               </w:rPr>
-              <w:t>71,52%</w:t>
             </w:r>
           </w:p>
         </w:tc>
@@ -7960,15 +7942,7 @@
             <w:tcW w:type="dxa" w:w="1176"/>
           </w:tcPr>
           <w:p>
-            <w:pPr>
-              <w:jc w:val="left"/>
-            </w:pPr>
-            <w:r/>
-            <w:r>
-              <w:rPr>
-                <w:rFonts w:ascii="Times New Roman" w:hAnsi="Times New Roman"/>
-                <w:sz w:val="20"/>
-              </w:rPr>
+            <w:r>
               <w:t>Rede Neural</w:t>
             </w:r>
           </w:p>
@@ -7978,16 +7952,8 @@
             <w:tcW w:type="dxa" w:w="1176"/>
           </w:tcPr>
           <w:p>
-            <w:pPr>
-              <w:jc w:val="left"/>
-            </w:pPr>
-            <w:r/>
-            <w:r>
-              <w:rPr>
-                <w:rFonts w:ascii="Times New Roman" w:hAnsi="Times New Roman"/>
-                <w:sz w:val="20"/>
-              </w:rPr>
-              <w:t>66,5%</w:t>
+            <w:r>
+              <w:t>66,0%</w:t>
             </w:r>
           </w:p>
         </w:tc>
@@ -7996,16 +7962,27 @@
             <w:tcW w:type="dxa" w:w="1176"/>
           </w:tcPr>
           <w:p>
-            <w:pPr>
-              <w:jc w:val="left"/>
-            </w:pPr>
-            <w:r/>
-            <w:r>
-              <w:rPr>
-                <w:rFonts w:ascii="Times New Roman" w:hAnsi="Times New Roman"/>
-                <w:b/>
-                <w:sz w:val="20"/>
-              </w:rPr>
+            <w:r>
+              <w:t>66,3%</w:t>
+            </w:r>
+          </w:p>
+        </w:tc>
+        <w:tc>
+          <w:tcPr>
+            <w:tcW w:type="dxa" w:w="1176"/>
+          </w:tcPr>
+          <w:p>
+            <w:r>
+              <w:t>65,0%</w:t>
+            </w:r>
+          </w:p>
+        </w:tc>
+        <w:tc>
+          <w:tcPr>
+            <w:tcW w:type="dxa" w:w="1176"/>
+          </w:tcPr>
+          <w:p>
+            <w:r>
               <w:t>65,6%</w:t>
             </w:r>
           </w:p>
@@ -8015,16 +7992,8 @@
             <w:tcW w:type="dxa" w:w="1176"/>
           </w:tcPr>
           <w:p>
-            <w:pPr>
-              <w:jc w:val="left"/>
-            </w:pPr>
-            <w:r/>
-            <w:r>
-              <w:rPr>
-                <w:rFonts w:ascii="Times New Roman" w:hAnsi="Times New Roman"/>
-                <w:sz w:val="20"/>
-              </w:rPr>
-              <w:t>69,5%</w:t>
+            <w:r>
+              <w:t>30,8%</w:t>
             </w:r>
           </w:p>
         </w:tc>
@@ -8033,16 +8002,8 @@
             <w:tcW w:type="dxa" w:w="1176"/>
           </w:tcPr>
           <w:p>
-            <w:pPr>
-              <w:jc w:val="left"/>
-            </w:pPr>
-            <w:r/>
-            <w:r>
-              <w:rPr>
-                <w:rFonts w:ascii="Times New Roman" w:hAnsi="Times New Roman"/>
-                <w:sz w:val="20"/>
-              </w:rPr>
-              <w:t>67,5%</w:t>
+            <w:r>
+              <w:t>34,0%</w:t>
             </w:r>
           </w:p>
         </w:tc>
@@ -8051,52 +8012,8 @@
             <w:tcW w:type="dxa" w:w="1176"/>
           </w:tcPr>
           <w:p>
-            <w:pPr>
-              <w:jc w:val="left"/>
-            </w:pPr>
-            <w:r/>
-            <w:r>
-              <w:rPr>
-                <w:rFonts w:ascii="Times New Roman" w:hAnsi="Times New Roman"/>
-                <w:sz w:val="20"/>
-              </w:rPr>
-              <w:t>30,3%</w:t>
-            </w:r>
-          </w:p>
-        </w:tc>
-        <w:tc>
-          <w:tcPr>
-            <w:tcW w:type="dxa" w:w="1176"/>
-          </w:tcPr>
-          <w:p>
-            <w:pPr>
-              <w:jc w:val="left"/>
-            </w:pPr>
-            <w:r/>
-            <w:r>
-              <w:rPr>
-                <w:rFonts w:ascii="Times New Roman" w:hAnsi="Times New Roman"/>
-                <w:sz w:val="20"/>
-              </w:rPr>
-              <w:t>33,5%</w:t>
-            </w:r>
-          </w:p>
-        </w:tc>
-        <w:tc>
-          <w:tcPr>
-            <w:tcW w:type="dxa" w:w="1176"/>
-          </w:tcPr>
-          <w:p>
-            <w:pPr>
-              <w:jc w:val="left"/>
-            </w:pPr>
-            <w:r/>
-            <w:r>
-              <w:rPr>
-                <w:rFonts w:ascii="Times New Roman" w:hAnsi="Times New Roman"/>
-                <w:sz w:val="20"/>
-              </w:rPr>
-              <w:t>3,2%</w:t>
+            <w:r>
+              <w:t>3,3%</w:t>
             </w:r>
           </w:p>
         </w:tc>
@@ -9855,15 +9772,7 @@
             <w:tcW w:type="dxa" w:w="2351"/>
           </w:tcPr>
           <w:p>
-            <w:pPr>
-              <w:jc w:val="left"/>
-            </w:pPr>
-            <w:r/>
-            <w:r>
-              <w:rPr>
-                <w:rFonts w:ascii="Times New Roman" w:hAnsi="Times New Roman"/>
-                <w:sz w:val="20"/>
-              </w:rPr>
+            <w:r>
               <w:t>0,50</w:t>
             </w:r>
           </w:p>
@@ -9873,16 +9782,8 @@
             <w:tcW w:type="dxa" w:w="2351"/>
           </w:tcPr>
           <w:p>
-            <w:pPr>
-              <w:jc w:val="left"/>
-            </w:pPr>
-            <w:r/>
-            <w:r>
-              <w:rPr>
-                <w:rFonts w:ascii="Times New Roman" w:hAnsi="Times New Roman"/>
-                <w:sz w:val="20"/>
-              </w:rPr>
-              <w:t>0,675</w:t>
+            <w:r>
+              <w:t>0,656</w:t>
             </w:r>
           </w:p>
         </w:tc>
@@ -9891,16 +9792,8 @@
             <w:tcW w:type="dxa" w:w="2351"/>
           </w:tcPr>
           <w:p>
-            <w:pPr>
-              <w:jc w:val="left"/>
-            </w:pPr>
-            <w:r/>
-            <w:r>
-              <w:rPr>
-                <w:rFonts w:ascii="Times New Roman" w:hAnsi="Times New Roman"/>
-                <w:sz w:val="20"/>
-              </w:rPr>
-              <w:t>66,5%</w:t>
+            <w:r>
+              <w:t>66,0%</w:t>
             </w:r>
           </w:p>
         </w:tc>
@@ -9909,16 +9802,8 @@
             <w:tcW w:type="dxa" w:w="2351"/>
           </w:tcPr>
           <w:p>
-            <w:pPr>
-              <w:jc w:val="left"/>
-            </w:pPr>
-            <w:r/>
-            <w:r>
-              <w:rPr>
-                <w:rFonts w:ascii="Times New Roman" w:hAnsi="Times New Roman"/>
-                <w:sz w:val="20"/>
-              </w:rPr>
-              <w:t>69,5%</w:t>
+            <w:r>
+              <w:t>65,0%</w:t>
             </w:r>
           </w:p>
         </w:tc>
@@ -10754,6 +10639,7 @@
     </w:p>
     <w:sectPr>
       <w:footerReference w:type="default" r:id="rId9"/>
+      <w:headerReference w:type="default" r:id="rId10"/>
       <w:pgSz w:w="12240" w:h="15840"/>
       <w:pgMar w:top="1701" w:right="1134" w:bottom="1134" w:left="1701" w:header="720" w:footer="720" w:gutter="0"/>
       <w:cols w:space="720"/>
@@ -10781,6 +10667,16 @@
     </w:r>
   </w:p>
 </w:ftr>
+</file>
+
+<file path=word/header1.xml><?xml version="1.0" encoding="utf-8"?>
+<w:hdr xmlns:m="http://schemas.openxmlformats.org/officeDocument/2006/math" xmlns:mc="http://schemas.openxmlformats.org/markup-compatibility/2006" xmlns:mo="http://schemas.microsoft.com/office/mac/office/2008/main" xmlns:mv="urn:schemas-microsoft-com:mac:vml" xmlns:o="urn:schemas-microsoft-com:office:office" xmlns:r="http://schemas.openxmlformats.org/officeDocument/2006/relationships" xmlns:v="urn:schemas-microsoft-com:vml" xmlns:w10="urn:schemas-microsoft-com:office:word" xmlns:w14="http://schemas.microsoft.com/office/word/2010/wordml" xmlns:w="http://schemas.openxmlformats.org/wordprocessingml/2006/main" xmlns:wne="http://schemas.microsoft.com/office/word/2006/wordml" xmlns:wp14="http://schemas.microsoft.com/office/word/2010/wordprocessingDrawing" xmlns:wp="http://schemas.openxmlformats.org/drawingml/2006/wordprocessingDrawing" xmlns:wpc="http://schemas.microsoft.com/office/word/2010/wordprocessingCanvas" xmlns:wpg="http://schemas.microsoft.com/office/word/2010/wordprocessingGroup" xmlns:wpi="http://schemas.microsoft.com/office/word/2010/wordprocessingInk" xmlns:wps="http://schemas.microsoft.com/office/word/2010/wordprocessingShape" mc:Ignorable="w14 wp14">
+  <w:p>
+    <w:pPr>
+      <w:pStyle w:val="Header"/>
+    </w:pPr>
+  </w:p>
+</w:hdr>
 </file>
 
 <file path=word/numbering.xml><?xml version="1.0" encoding="utf-8"?>

</xml_diff>